<commit_message>
content(2027): update bases dates, docs, and season year
- dictionary: XVI edicion, 2027 dates, IV Final Nacional, sponsor list (+Klett Sprachen, -Westermann)
- bases_aleman: 2026-27 German rules PDF (replaces 2025_26)
- impresos: refreshed Lista de control + edidable Bescheinigung
- Footer: high-res Hessen logo + Ecuador embassy added as sponsor
- AdminList default year 2027; ImageGallery default 2026
- Bases: 70-school cap for the 2027 edition
- Register: drop debug console.logs (registration still closed)
</commit_message>
<xml_diff>
--- a/src/assets/docus/impresos/Lista_de_control.docx
+++ b/src/assets/docus/impresos/Lista_de_control.docx
@@ -1,6 +1,6 @@
 
 <file path=word/document.xml><?xml version="1.0" encoding="utf-8"?>
-<w:document xmlns:wpc="http://schemas.microsoft.com/office/word/2010/wordprocessingCanvas" xmlns:cx="http://schemas.microsoft.com/office/drawing/2014/chartex" xmlns:cx1="http://schemas.microsoft.com/office/drawing/2015/9/8/chartex" xmlns:cx2="http://schemas.microsoft.com/office/drawing/2015/10/21/chartex" xmlns:cx3="http://schemas.microsoft.com/office/drawing/2016/5/9/chartex" xmlns:cx4="http://schemas.microsoft.com/office/drawing/2016/5/10/chartex" xmlns:cx5="http://schemas.microsoft.com/office/drawing/2016/5/11/chartex" xmlns:cx6="http://schemas.microsoft.com/office/drawing/2016/5/12/chartex" xmlns:cx7="http://schemas.microsoft.com/office/drawing/2016/5/13/chartex" xmlns:cx8="http://schemas.microsoft.com/office/drawing/2016/5/14/chartex" xmlns:mc="http://schemas.openxmlformats.org/markup-compatibility/2006" xmlns:aink="http://schemas.microsoft.com/office/drawing/2016/ink" xmlns:am3d="http://schemas.microsoft.com/office/drawing/2017/model3d" xmlns:o="urn:schemas-microsoft-com:office:office" xmlns:r="http://schemas.openxmlformats.org/officeDocument/2006/relationships" xmlns:m="http://schemas.openxmlformats.org/officeDocument/2006/math" xmlns:v="urn:schemas-microsoft-com:vml" xmlns:wp14="http://schemas.microsoft.com/office/word/2010/wordprocessingDrawing" xmlns:wp="http://schemas.openxmlformats.org/drawingml/2006/wordprocessingDrawing" xmlns:w10="urn:schemas-microsoft-com:office:word" xmlns:w="http://schemas.openxmlformats.org/wordprocessingml/2006/main" xmlns:w14="http://schemas.microsoft.com/office/word/2010/wordml" xmlns:w15="http://schemas.microsoft.com/office/word/2012/wordml" xmlns:w16cid="http://schemas.microsoft.com/office/word/2016/wordml/cid" xmlns:w16se="http://schemas.microsoft.com/office/word/2015/wordml/symex" xmlns:wpg="http://schemas.microsoft.com/office/word/2010/wordprocessingGroup" xmlns:wpi="http://schemas.microsoft.com/office/word/2010/wordprocessingInk" xmlns:wne="http://schemas.microsoft.com/office/word/2006/wordml" xmlns:wps="http://schemas.microsoft.com/office/word/2010/wordprocessingShape" mc:Ignorable="w14 w15 w16se w16cid wp14">
+<w:document xmlns:wpc="http://schemas.microsoft.com/office/word/2010/wordprocessingCanvas" xmlns:cx="http://schemas.microsoft.com/office/drawing/2014/chartex" xmlns:cx1="http://schemas.microsoft.com/office/drawing/2015/9/8/chartex" xmlns:cx2="http://schemas.microsoft.com/office/drawing/2015/10/21/chartex" xmlns:cx3="http://schemas.microsoft.com/office/drawing/2016/5/9/chartex" xmlns:cx4="http://schemas.microsoft.com/office/drawing/2016/5/10/chartex" xmlns:cx5="http://schemas.microsoft.com/office/drawing/2016/5/11/chartex" xmlns:cx6="http://schemas.microsoft.com/office/drawing/2016/5/12/chartex" xmlns:cx7="http://schemas.microsoft.com/office/drawing/2016/5/13/chartex" xmlns:cx8="http://schemas.microsoft.com/office/drawing/2016/5/14/chartex" xmlns:mc="http://schemas.openxmlformats.org/markup-compatibility/2006" xmlns:aink="http://schemas.microsoft.com/office/drawing/2016/ink" xmlns:am3d="http://schemas.microsoft.com/office/drawing/2017/model3d" xmlns:o="urn:schemas-microsoft-com:office:office" xmlns:oel="http://schemas.microsoft.com/office/2019/extlst" xmlns:r="http://schemas.openxmlformats.org/officeDocument/2006/relationships" xmlns:m="http://schemas.openxmlformats.org/officeDocument/2006/math" xmlns:v="urn:schemas-microsoft-com:vml" xmlns:wp14="http://schemas.microsoft.com/office/word/2010/wordprocessingDrawing" xmlns:wp="http://schemas.openxmlformats.org/drawingml/2006/wordprocessingDrawing" xmlns:w10="urn:schemas-microsoft-com:office:word" xmlns:w="http://schemas.openxmlformats.org/wordprocessingml/2006/main" xmlns:w14="http://schemas.microsoft.com/office/word/2010/wordml" xmlns:w15="http://schemas.microsoft.com/office/word/2012/wordml" xmlns:w16cex="http://schemas.microsoft.com/office/word/2018/wordml/cex" xmlns:w16cid="http://schemas.microsoft.com/office/word/2016/wordml/cid" xmlns:w16="http://schemas.microsoft.com/office/word/2018/wordml" xmlns:w16du="http://schemas.microsoft.com/office/word/2023/wordml/word16du" xmlns:w16sdtdh="http://schemas.microsoft.com/office/word/2020/wordml/sdtdatahash" xmlns:w16sdtfl="http://schemas.microsoft.com/office/word/2024/wordml/sdtformatlock" xmlns:w16se="http://schemas.microsoft.com/office/word/2015/wordml/symex" xmlns:wpg="http://schemas.microsoft.com/office/word/2010/wordprocessingGroup" xmlns:wpi="http://schemas.microsoft.com/office/word/2010/wordprocessingInk" xmlns:wne="http://schemas.microsoft.com/office/word/2006/wordml" xmlns:wps="http://schemas.microsoft.com/office/word/2010/wordprocessingShape" mc:Ignorable="w14 w15 w16se w16cid w16 w16cex w16sdtdh w16sdtfl w16du wp14">
   <w:body>
     <w:p>
       <w:pPr>
@@ -90,7 +90,7 @@
           <w:szCs w:val="32"/>
           <w:lang w:val="es-ES"/>
         </w:rPr>
-        <w:t xml:space="preserve"> edición </w:t>
+        <w:t>I</w:t>
       </w:r>
       <w:r>
         <w:rPr>
@@ -101,7 +101,7 @@
           <w:szCs w:val="32"/>
           <w:lang w:val="es-ES"/>
         </w:rPr>
-        <w:t xml:space="preserve">del </w:t>
+        <w:t xml:space="preserve"> edición </w:t>
       </w:r>
       <w:r>
         <w:rPr>
@@ -112,7 +112,42 @@
           <w:szCs w:val="32"/>
           <w:lang w:val="es-ES"/>
         </w:rPr>
-        <w:t>Concurso Escolar de Lectura en Español “Leo, le</w:t>
+        <w:t xml:space="preserve">del </w:t>
+      </w:r>
+      <w:r>
+        <w:rPr>
+          <w:rFonts w:ascii="Microsoft New Tai Lue" w:hAnsi="Microsoft New Tai Lue" w:cs="Microsoft New Tai Lue"/>
+          <w:b/>
+          <w:bCs/>
+          <w:sz w:val="32"/>
+          <w:szCs w:val="32"/>
+          <w:lang w:val="es-ES"/>
+        </w:rPr>
+        <w:t xml:space="preserve">Concurso Escolar de Lectura en </w:t>
+      </w:r>
+      <w:proofErr w:type="gramStart"/>
+      <w:r>
+        <w:rPr>
+          <w:rFonts w:ascii="Microsoft New Tai Lue" w:hAnsi="Microsoft New Tai Lue" w:cs="Microsoft New Tai Lue"/>
+          <w:b/>
+          <w:bCs/>
+          <w:sz w:val="32"/>
+          <w:szCs w:val="32"/>
+          <w:lang w:val="es-ES"/>
+        </w:rPr>
+        <w:t>Español</w:t>
+      </w:r>
+      <w:proofErr w:type="gramEnd"/>
+      <w:r>
+        <w:rPr>
+          <w:rFonts w:ascii="Microsoft New Tai Lue" w:hAnsi="Microsoft New Tai Lue" w:cs="Microsoft New Tai Lue"/>
+          <w:b/>
+          <w:bCs/>
+          <w:sz w:val="32"/>
+          <w:szCs w:val="32"/>
+          <w:lang w:val="es-ES"/>
+        </w:rPr>
+        <w:t xml:space="preserve"> “Leo, le</w:t>
       </w:r>
       <w:r>
         <w:rPr>
@@ -321,7 +356,7 @@
           <w:szCs w:val="21"/>
           <w:lang w:val="es-ES"/>
         </w:rPr>
-        <w:t>5</w:t>
+        <w:t>6</w:t>
       </w:r>
       <w:r>
         <w:rPr>
@@ -579,18 +614,40 @@
           <w:szCs w:val="21"/>
           <w:lang w:val="es-ES"/>
         </w:rPr>
-        <w:t>viernes 2</w:t>
-      </w:r>
-      <w:r>
-        <w:rPr>
-          <w:rFonts w:asciiTheme="minorHAnsi" w:hAnsiTheme="minorHAnsi" w:cstheme="minorHAnsi"/>
-          <w:b/>
-          <w:bCs/>
-          <w:sz w:val="21"/>
-          <w:szCs w:val="21"/>
-          <w:lang w:val="es-ES"/>
-        </w:rPr>
-        <w:t>9 de mayo</w:t>
+        <w:t xml:space="preserve">viernes </w:t>
+      </w:r>
+      <w:r>
+        <w:rPr>
+          <w:rFonts w:asciiTheme="minorHAnsi" w:hAnsiTheme="minorHAnsi" w:cstheme="minorHAnsi"/>
+          <w:b/>
+          <w:bCs/>
+          <w:sz w:val="21"/>
+          <w:szCs w:val="21"/>
+          <w:lang w:val="es-ES"/>
+        </w:rPr>
+        <w:t>30</w:t>
+      </w:r>
+      <w:r>
+        <w:rPr>
+          <w:rFonts w:asciiTheme="minorHAnsi" w:hAnsiTheme="minorHAnsi" w:cstheme="minorHAnsi"/>
+          <w:b/>
+          <w:bCs/>
+          <w:sz w:val="21"/>
+          <w:szCs w:val="21"/>
+          <w:lang w:val="es-ES"/>
+        </w:rPr>
+        <w:t xml:space="preserve"> de </w:t>
+      </w:r>
+      <w:r>
+        <w:rPr>
+          <w:rFonts w:asciiTheme="minorHAnsi" w:hAnsiTheme="minorHAnsi" w:cstheme="minorHAnsi"/>
+          <w:b/>
+          <w:bCs/>
+          <w:sz w:val="21"/>
+          <w:szCs w:val="21"/>
+          <w:lang w:val="es-ES"/>
+        </w:rPr>
+        <w:t>abril</w:t>
       </w:r>
       <w:r>
         <w:rPr>
@@ -612,7 +669,7 @@
           <w:szCs w:val="21"/>
           <w:lang w:val="es-ES"/>
         </w:rPr>
-        <w:t>6</w:t>
+        <w:t>7</w:t>
       </w:r>
     </w:p>
     <w:p>
@@ -1912,7 +1969,7 @@
           <w:szCs w:val="21"/>
           <w:lang w:val="es-ES"/>
         </w:rPr>
-        <w:t>6</w:t>
+        <w:t>7</w:t>
       </w:r>
       <w:r>
         <w:rPr>
@@ -1958,8 +2015,6 @@
           <w:lang w:val="es-ES"/>
         </w:rPr>
       </w:pPr>
-      <w:bookmarkStart w:id="2" w:name="_GoBack"/>
-      <w:bookmarkEnd w:id="2"/>
     </w:p>
     <w:p>
       <w:pPr>
@@ -2038,7 +2093,7 @@
           <w:lang w:val="es-ES"/>
         </w:rPr>
       </w:pPr>
-      <w:bookmarkStart w:id="3" w:name="_Hlk115716277"/>
+      <w:bookmarkStart w:id="2" w:name="_Hlk115716277"/>
       <w:r>
         <w:rPr>
           <w:rFonts w:asciiTheme="minorHAnsi" w:hAnsiTheme="minorHAnsi" w:cstheme="minorHAnsi"/>
@@ -2066,16 +2121,7 @@
           <w:szCs w:val="21"/>
           <w:lang w:val="es-ES"/>
         </w:rPr>
-        <w:t xml:space="preserve"> si los profesores no quieren </w:t>
-      </w:r>
-      <w:r>
-        <w:rPr>
-          <w:rFonts w:asciiTheme="minorHAnsi" w:hAnsiTheme="minorHAnsi" w:cstheme="minorHAnsi"/>
-          <w:sz w:val="21"/>
-          <w:szCs w:val="21"/>
-          <w:lang w:val="es-ES"/>
-        </w:rPr>
-        <w:t>o no pueden participar en las calificaciones.</w:t>
+        <w:t>.</w:t>
       </w:r>
     </w:p>
     <w:p>
@@ -2304,7 +2350,25 @@
           <w:szCs w:val="21"/>
           <w:lang w:val="es-ES"/>
         </w:rPr>
-        <w:t xml:space="preserve"> alumnos no tengan ninguna anotación</w:t>
+        <w:t xml:space="preserve"> alumnos </w:t>
+      </w:r>
+      <w:r>
+        <w:rPr>
+          <w:rFonts w:asciiTheme="minorHAnsi" w:hAnsiTheme="minorHAnsi" w:cstheme="minorHAnsi"/>
+          <w:sz w:val="21"/>
+          <w:szCs w:val="21"/>
+          <w:lang w:val="es-ES"/>
+        </w:rPr>
+        <w:t xml:space="preserve">a la hora de la lectura en el concurso interno </w:t>
+      </w:r>
+      <w:r>
+        <w:rPr>
+          <w:rFonts w:asciiTheme="minorHAnsi" w:hAnsiTheme="minorHAnsi" w:cstheme="minorHAnsi"/>
+          <w:sz w:val="21"/>
+          <w:szCs w:val="21"/>
+          <w:lang w:val="es-ES"/>
+        </w:rPr>
+        <w:t>no tengan ninguna anotación</w:t>
       </w:r>
       <w:r>
         <w:rPr>
@@ -2932,7 +2996,7 @@
         </w:rPr>
       </w:pPr>
     </w:p>
-    <w:bookmarkEnd w:id="3"/>
+    <w:bookmarkEnd w:id="2"/>
     <w:p>
       <w:pPr>
         <w:spacing w:before="160" w:after="240"/>
@@ -3003,7 +3067,7 @@
           <w:szCs w:val="21"/>
           <w:lang w:val="es-ES"/>
         </w:rPr>
-        <w:t>30</w:t>
+        <w:t>15</w:t>
       </w:r>
       <w:r>
         <w:rPr>
@@ -3025,7 +3089,7 @@
           <w:szCs w:val="21"/>
           <w:lang w:val="es-ES"/>
         </w:rPr>
-        <w:t>6</w:t>
+        <w:t>7</w:t>
       </w:r>
       <w:r>
         <w:rPr>
@@ -3387,7 +3451,25 @@
           <w:szCs w:val="21"/>
           <w:lang w:val="es-ES"/>
         </w:rPr>
-        <w:t xml:space="preserve"> o comprobar que los textos que utilizarán vuestros alumnos no tengan ninguna anotación.</w:t>
+        <w:t xml:space="preserve"> o comprobar que los textos que utilizarán vuestros alumnos </w:t>
+      </w:r>
+      <w:r>
+        <w:rPr>
+          <w:rFonts w:asciiTheme="minorHAnsi" w:hAnsiTheme="minorHAnsi" w:cstheme="minorHAnsi"/>
+          <w:sz w:val="21"/>
+          <w:szCs w:val="21"/>
+          <w:lang w:val="es-ES"/>
+        </w:rPr>
+        <w:t xml:space="preserve">a la hora de la lectura durante la semifinal </w:t>
+      </w:r>
+      <w:r>
+        <w:rPr>
+          <w:rFonts w:asciiTheme="minorHAnsi" w:hAnsiTheme="minorHAnsi" w:cstheme="minorHAnsi"/>
+          <w:sz w:val="21"/>
+          <w:szCs w:val="21"/>
+          <w:lang w:val="es-ES"/>
+        </w:rPr>
+        <w:t>no tengan ninguna anotación.</w:t>
       </w:r>
     </w:p>
     <w:p>
@@ -3611,7 +3693,7 @@
           <w:lang w:val="es-ES"/>
         </w:rPr>
       </w:pPr>
-      <w:bookmarkStart w:id="4" w:name="_Hlk116118782"/>
+      <w:bookmarkStart w:id="3" w:name="_Hlk116118782"/>
       <w:r>
         <w:rPr>
           <w:rFonts w:asciiTheme="minorHAnsi" w:hAnsiTheme="minorHAnsi" w:cstheme="minorHAnsi"/>
@@ -3632,8 +3714,8 @@
         </w:rPr>
         <w:t xml:space="preserve">, </w:t>
       </w:r>
-      <w:bookmarkStart w:id="5" w:name="_Hlk116019987"/>
-      <w:bookmarkEnd w:id="4"/>
+      <w:bookmarkStart w:id="4" w:name="_Hlk116019987"/>
+      <w:bookmarkEnd w:id="3"/>
       <w:r>
         <w:rPr>
           <w:rFonts w:asciiTheme="minorHAnsi" w:hAnsiTheme="minorHAnsi" w:cstheme="minorHAnsi"/>
@@ -3672,7 +3754,7 @@
         </w:rPr>
         <w:t xml:space="preserve">Si participáis en una semifinal </w:t>
       </w:r>
-      <w:bookmarkEnd w:id="5"/>
+      <w:bookmarkEnd w:id="4"/>
       <w:r>
         <w:rPr>
           <w:rFonts w:asciiTheme="minorHAnsi" w:hAnsiTheme="minorHAnsi" w:cstheme="minorHAnsi"/>
@@ -4000,43 +4082,43 @@
           <w:szCs w:val="21"/>
           <w:lang w:val="es-ES"/>
         </w:rPr>
-        <w:t>Es preferible que,</w:t>
-      </w:r>
-      <w:r>
-        <w:rPr>
-          <w:rFonts w:asciiTheme="minorHAnsi" w:hAnsiTheme="minorHAnsi" w:cstheme="minorHAnsi"/>
-          <w:sz w:val="21"/>
-          <w:szCs w:val="21"/>
-          <w:lang w:val="es-ES"/>
-        </w:rPr>
-        <w:t xml:space="preserve"> siempre que sea posible</w:t>
-      </w:r>
-      <w:r>
-        <w:rPr>
-          <w:rFonts w:asciiTheme="minorHAnsi" w:hAnsiTheme="minorHAnsi" w:cstheme="minorHAnsi"/>
-          <w:sz w:val="21"/>
-          <w:szCs w:val="21"/>
-          <w:lang w:val="es-ES"/>
-        </w:rPr>
-        <w:t>,</w:t>
-      </w:r>
-      <w:r>
-        <w:rPr>
-          <w:rFonts w:asciiTheme="minorHAnsi" w:hAnsiTheme="minorHAnsi" w:cstheme="minorHAnsi"/>
-          <w:sz w:val="21"/>
-          <w:szCs w:val="21"/>
-          <w:lang w:val="es-ES"/>
-        </w:rPr>
-        <w:t xml:space="preserve"> los</w:t>
-      </w:r>
-      <w:r>
-        <w:rPr>
-          <w:rFonts w:asciiTheme="minorHAnsi" w:hAnsiTheme="minorHAnsi" w:cstheme="minorHAnsi"/>
-          <w:sz w:val="21"/>
-          <w:szCs w:val="21"/>
-          <w:lang w:val="es-ES"/>
-        </w:rPr>
-        <w:t xml:space="preserve"> jurados de las semifinales estén formados por personas </w:t>
+        <w:t>L</w:t>
+      </w:r>
+      <w:r>
+        <w:rPr>
+          <w:rFonts w:asciiTheme="minorHAnsi" w:hAnsiTheme="minorHAnsi" w:cstheme="minorHAnsi"/>
+          <w:sz w:val="21"/>
+          <w:szCs w:val="21"/>
+          <w:lang w:val="es-ES"/>
+        </w:rPr>
+        <w:t>os</w:t>
+      </w:r>
+      <w:r>
+        <w:rPr>
+          <w:rFonts w:asciiTheme="minorHAnsi" w:hAnsiTheme="minorHAnsi" w:cstheme="minorHAnsi"/>
+          <w:sz w:val="21"/>
+          <w:szCs w:val="21"/>
+          <w:lang w:val="es-ES"/>
+        </w:rPr>
+        <w:t xml:space="preserve"> jurados de las semifinales est</w:t>
+      </w:r>
+      <w:r>
+        <w:rPr>
+          <w:rFonts w:asciiTheme="minorHAnsi" w:hAnsiTheme="minorHAnsi" w:cstheme="minorHAnsi"/>
+          <w:sz w:val="21"/>
+          <w:szCs w:val="21"/>
+          <w:lang w:val="es-ES"/>
+        </w:rPr>
+        <w:t>arán</w:t>
+      </w:r>
+      <w:r>
+        <w:rPr>
+          <w:rFonts w:asciiTheme="minorHAnsi" w:hAnsiTheme="minorHAnsi" w:cstheme="minorHAnsi"/>
+          <w:sz w:val="21"/>
+          <w:szCs w:val="21"/>
+          <w:lang w:val="es-ES"/>
+        </w:rPr>
+        <w:t xml:space="preserve"> formados por personas </w:t>
       </w:r>
       <w:r>
         <w:rPr>
@@ -4063,17 +4145,7 @@
           <w:szCs w:val="21"/>
           <w:lang w:val="es-ES"/>
         </w:rPr>
-        <w:t xml:space="preserve"> </w:t>
-      </w:r>
-      <w:r>
-        <w:rPr>
-          <w:rFonts w:asciiTheme="minorHAnsi" w:hAnsiTheme="minorHAnsi" w:cstheme="minorHAnsi"/>
-          <w:sz w:val="21"/>
-          <w:szCs w:val="21"/>
-          <w:shd w:val="clear" w:color="auto" w:fill="FFFFFF"/>
-          <w:lang w:val="es-ES"/>
-        </w:rPr>
-        <w:t>(por lo menos 2 de los miembros del jurado)</w:t>
+        <w:t>.</w:t>
       </w:r>
     </w:p>
     <w:p>
@@ -4339,7 +4411,7 @@
           <w:szCs w:val="28"/>
           <w:lang w:val="es-ES"/>
         </w:rPr>
-        <w:t xml:space="preserve"> viernes 2</w:t>
+        <w:t xml:space="preserve"> viernes </w:t>
       </w:r>
       <w:r>
         <w:rPr>
@@ -4350,7 +4422,7 @@
           <w:szCs w:val="28"/>
           <w:lang w:val="es-ES"/>
         </w:rPr>
-        <w:t>9</w:t>
+        <w:t xml:space="preserve">30 </w:t>
       </w:r>
       <w:r>
         <w:rPr>
@@ -4361,7 +4433,7 @@
           <w:szCs w:val="28"/>
           <w:lang w:val="es-ES"/>
         </w:rPr>
-        <w:t xml:space="preserve"> de </w:t>
+        <w:t xml:space="preserve">de </w:t>
       </w:r>
       <w:r>
         <w:rPr>
@@ -4372,7 +4444,7 @@
           <w:szCs w:val="28"/>
           <w:lang w:val="es-ES"/>
         </w:rPr>
-        <w:t>mayo</w:t>
+        <w:t>abril</w:t>
       </w:r>
       <w:r>
         <w:rPr>
@@ -4394,7 +4466,7 @@
           <w:szCs w:val="28"/>
           <w:lang w:val="es-ES"/>
         </w:rPr>
-        <w:t>6</w:t>
+        <w:t>7</w:t>
       </w:r>
     </w:p>
     <w:p>
@@ -4644,18 +4716,7 @@
           <w:szCs w:val="21"/>
           <w:lang w:val="es-ES"/>
         </w:rPr>
-        <w:t>2</w:t>
-      </w:r>
-      <w:r>
-        <w:rPr>
-          <w:rFonts w:asciiTheme="minorHAnsi" w:hAnsiTheme="minorHAnsi" w:cstheme="minorHAnsi"/>
-          <w:b/>
-          <w:bCs/>
-          <w:sz w:val="21"/>
-          <w:szCs w:val="21"/>
-          <w:lang w:val="es-ES"/>
-        </w:rPr>
-        <w:t>9</w:t>
+        <w:t>30</w:t>
       </w:r>
       <w:r>
         <w:rPr>
@@ -4677,7 +4738,7 @@
           <w:szCs w:val="21"/>
           <w:lang w:val="es-ES"/>
         </w:rPr>
-        <w:t>mayo</w:t>
+        <w:t>abril</w:t>
       </w:r>
       <w:r>
         <w:rPr>
@@ -4699,7 +4760,7 @@
           <w:szCs w:val="21"/>
           <w:lang w:val="es-ES"/>
         </w:rPr>
-        <w:t>6</w:t>
+        <w:t>7</w:t>
       </w:r>
       <w:r>
         <w:rPr>
@@ -4858,12 +4919,13 @@
       <w:r>
         <w:rPr>
           <w:noProof/>
+          <w:lang w:val="es-ES"/>
         </w:rPr>
         <w:drawing>
-          <wp:inline distT="0" distB="0" distL="0" distR="0" wp14:anchorId="76B98760" wp14:editId="6715025A">
-            <wp:extent cx="1760593" cy="2305878"/>
-            <wp:effectExtent l="0" t="0" r="0" b="0"/>
-            <wp:docPr id="3" name="Bild 2" descr="C:\Users\a.feregrino-langer\AppData\Local\Microsoft\Windows\INetCache\Content.MSO\C5C65651.tmp"/>
+          <wp:inline distT="0" distB="0" distL="0" distR="0" wp14:anchorId="08F51E80" wp14:editId="52DC0209">
+            <wp:extent cx="2293620" cy="2962340"/>
+            <wp:effectExtent l="0" t="0" r="0" b="9525"/>
+            <wp:docPr id="157130335" name="Grafik 1"/>
             <wp:cNvGraphicFramePr>
               <a:graphicFrameLocks xmlns:a="http://schemas.openxmlformats.org/drawingml/2006/main" noChangeAspect="1"/>
             </wp:cNvGraphicFramePr>
@@ -4871,7 +4933,7 @@
               <a:graphicData uri="http://schemas.openxmlformats.org/drawingml/2006/picture">
                 <pic:pic xmlns:pic="http://schemas.openxmlformats.org/drawingml/2006/picture">
                   <pic:nvPicPr>
-                    <pic:cNvPr id="0" name="Picture 2" descr="C:\Users\a.feregrino-langer\AppData\Local\Microsoft\Windows\INetCache\Content.MSO\C5C65651.tmp"/>
+                    <pic:cNvPr id="0" name="Picture 2"/>
                     <pic:cNvPicPr>
                       <a:picLocks noChangeAspect="1" noChangeArrowheads="1"/>
                     </pic:cNvPicPr>
@@ -4892,15 +4954,12 @@
                   <pic:spPr bwMode="auto">
                     <a:xfrm>
                       <a:off x="0" y="0"/>
-                      <a:ext cx="1797221" cy="2353850"/>
+                      <a:ext cx="2316585" cy="2992001"/>
                     </a:xfrm>
                     <a:prstGeom prst="rect">
                       <a:avLst/>
                     </a:prstGeom>
                     <a:noFill/>
-                    <a:ln>
-                      <a:noFill/>
-                    </a:ln>
                   </pic:spPr>
                 </pic:pic>
               </a:graphicData>
@@ -4929,7 +4988,7 @@
 </file>
 
 <file path=word/endnotes.xml><?xml version="1.0" encoding="utf-8"?>
-<w:endnotes xmlns:wpc="http://schemas.microsoft.com/office/word/2010/wordprocessingCanvas" xmlns:cx="http://schemas.microsoft.com/office/drawing/2014/chartex" xmlns:cx1="http://schemas.microsoft.com/office/drawing/2015/9/8/chartex" xmlns:cx2="http://schemas.microsoft.com/office/drawing/2015/10/21/chartex" xmlns:cx3="http://schemas.microsoft.com/office/drawing/2016/5/9/chartex" xmlns:cx4="http://schemas.microsoft.com/office/drawing/2016/5/10/chartex" xmlns:cx5="http://schemas.microsoft.com/office/drawing/2016/5/11/chartex" xmlns:cx6="http://schemas.microsoft.com/office/drawing/2016/5/12/chartex" xmlns:cx7="http://schemas.microsoft.com/office/drawing/2016/5/13/chartex" xmlns:cx8="http://schemas.microsoft.com/office/drawing/2016/5/14/chartex" xmlns:mc="http://schemas.openxmlformats.org/markup-compatibility/2006" xmlns:aink="http://schemas.microsoft.com/office/drawing/2016/ink" xmlns:am3d="http://schemas.microsoft.com/office/drawing/2017/model3d" xmlns:o="urn:schemas-microsoft-com:office:office" xmlns:r="http://schemas.openxmlformats.org/officeDocument/2006/relationships" xmlns:m="http://schemas.openxmlformats.org/officeDocument/2006/math" xmlns:v="urn:schemas-microsoft-com:vml" xmlns:wp14="http://schemas.microsoft.com/office/word/2010/wordprocessingDrawing" xmlns:wp="http://schemas.openxmlformats.org/drawingml/2006/wordprocessingDrawing" xmlns:w10="urn:schemas-microsoft-com:office:word" xmlns:w="http://schemas.openxmlformats.org/wordprocessingml/2006/main" xmlns:w14="http://schemas.microsoft.com/office/word/2010/wordml" xmlns:w15="http://schemas.microsoft.com/office/word/2012/wordml" xmlns:w16cid="http://schemas.microsoft.com/office/word/2016/wordml/cid" xmlns:w16se="http://schemas.microsoft.com/office/word/2015/wordml/symex" xmlns:wpg="http://schemas.microsoft.com/office/word/2010/wordprocessingGroup" xmlns:wpi="http://schemas.microsoft.com/office/word/2010/wordprocessingInk" xmlns:wne="http://schemas.microsoft.com/office/word/2006/wordml" xmlns:wps="http://schemas.microsoft.com/office/word/2010/wordprocessingShape" mc:Ignorable="w14 w15 w16se w16cid wp14">
+<w:endnotes xmlns:wpc="http://schemas.microsoft.com/office/word/2010/wordprocessingCanvas" xmlns:cx="http://schemas.microsoft.com/office/drawing/2014/chartex" xmlns:cx1="http://schemas.microsoft.com/office/drawing/2015/9/8/chartex" xmlns:cx2="http://schemas.microsoft.com/office/drawing/2015/10/21/chartex" xmlns:cx3="http://schemas.microsoft.com/office/drawing/2016/5/9/chartex" xmlns:cx4="http://schemas.microsoft.com/office/drawing/2016/5/10/chartex" xmlns:cx5="http://schemas.microsoft.com/office/drawing/2016/5/11/chartex" xmlns:cx6="http://schemas.microsoft.com/office/drawing/2016/5/12/chartex" xmlns:cx7="http://schemas.microsoft.com/office/drawing/2016/5/13/chartex" xmlns:cx8="http://schemas.microsoft.com/office/drawing/2016/5/14/chartex" xmlns:mc="http://schemas.openxmlformats.org/markup-compatibility/2006" xmlns:aink="http://schemas.microsoft.com/office/drawing/2016/ink" xmlns:am3d="http://schemas.microsoft.com/office/drawing/2017/model3d" xmlns:o="urn:schemas-microsoft-com:office:office" xmlns:oel="http://schemas.microsoft.com/office/2019/extlst" xmlns:r="http://schemas.openxmlformats.org/officeDocument/2006/relationships" xmlns:m="http://schemas.openxmlformats.org/officeDocument/2006/math" xmlns:v="urn:schemas-microsoft-com:vml" xmlns:wp14="http://schemas.microsoft.com/office/word/2010/wordprocessingDrawing" xmlns:wp="http://schemas.openxmlformats.org/drawingml/2006/wordprocessingDrawing" xmlns:w10="urn:schemas-microsoft-com:office:word" xmlns:w="http://schemas.openxmlformats.org/wordprocessingml/2006/main" xmlns:w14="http://schemas.microsoft.com/office/word/2010/wordml" xmlns:w15="http://schemas.microsoft.com/office/word/2012/wordml" xmlns:w16cex="http://schemas.microsoft.com/office/word/2018/wordml/cex" xmlns:w16cid="http://schemas.microsoft.com/office/word/2016/wordml/cid" xmlns:w16="http://schemas.microsoft.com/office/word/2018/wordml" xmlns:w16du="http://schemas.microsoft.com/office/word/2023/wordml/word16du" xmlns:w16sdtdh="http://schemas.microsoft.com/office/word/2020/wordml/sdtdatahash" xmlns:w16sdtfl="http://schemas.microsoft.com/office/word/2024/wordml/sdtformatlock" xmlns:w16se="http://schemas.microsoft.com/office/word/2015/wordml/symex" xmlns:wpg="http://schemas.microsoft.com/office/word/2010/wordprocessingGroup" xmlns:wpi="http://schemas.microsoft.com/office/word/2010/wordprocessingInk" xmlns:wne="http://schemas.microsoft.com/office/word/2006/wordml" xmlns:wps="http://schemas.microsoft.com/office/word/2010/wordprocessingShape" mc:Ignorable="w14 w15 w16se w16cid w16 w16cex w16sdtdh w16sdtfl w16du wp14">
   <w:endnote w:type="separator" w:id="-1">
     <w:p>
       <w:r>
@@ -4948,7 +5007,7 @@
 </file>
 
 <file path=word/footer1.xml><?xml version="1.0" encoding="utf-8"?>
-<w:ftr xmlns:wpc="http://schemas.microsoft.com/office/word/2010/wordprocessingCanvas" xmlns:cx="http://schemas.microsoft.com/office/drawing/2014/chartex" xmlns:cx1="http://schemas.microsoft.com/office/drawing/2015/9/8/chartex" xmlns:cx2="http://schemas.microsoft.com/office/drawing/2015/10/21/chartex" xmlns:cx3="http://schemas.microsoft.com/office/drawing/2016/5/9/chartex" xmlns:cx4="http://schemas.microsoft.com/office/drawing/2016/5/10/chartex" xmlns:cx5="http://schemas.microsoft.com/office/drawing/2016/5/11/chartex" xmlns:cx6="http://schemas.microsoft.com/office/drawing/2016/5/12/chartex" xmlns:cx7="http://schemas.microsoft.com/office/drawing/2016/5/13/chartex" xmlns:cx8="http://schemas.microsoft.com/office/drawing/2016/5/14/chartex" xmlns:mc="http://schemas.openxmlformats.org/markup-compatibility/2006" xmlns:aink="http://schemas.microsoft.com/office/drawing/2016/ink" xmlns:am3d="http://schemas.microsoft.com/office/drawing/2017/model3d" xmlns:o="urn:schemas-microsoft-com:office:office" xmlns:r="http://schemas.openxmlformats.org/officeDocument/2006/relationships" xmlns:m="http://schemas.openxmlformats.org/officeDocument/2006/math" xmlns:v="urn:schemas-microsoft-com:vml" xmlns:wp14="http://schemas.microsoft.com/office/word/2010/wordprocessingDrawing" xmlns:wp="http://schemas.openxmlformats.org/drawingml/2006/wordprocessingDrawing" xmlns:w10="urn:schemas-microsoft-com:office:word" xmlns:w="http://schemas.openxmlformats.org/wordprocessingml/2006/main" xmlns:w14="http://schemas.microsoft.com/office/word/2010/wordml" xmlns:w15="http://schemas.microsoft.com/office/word/2012/wordml" xmlns:w16cid="http://schemas.microsoft.com/office/word/2016/wordml/cid" xmlns:w16se="http://schemas.microsoft.com/office/word/2015/wordml/symex" xmlns:wpg="http://schemas.microsoft.com/office/word/2010/wordprocessingGroup" xmlns:wpi="http://schemas.microsoft.com/office/word/2010/wordprocessingInk" xmlns:wne="http://schemas.microsoft.com/office/word/2006/wordml" xmlns:wps="http://schemas.microsoft.com/office/word/2010/wordprocessingShape" mc:Ignorable="w14 w15 w16se w16cid wp14">
+<w:ftr xmlns:wpc="http://schemas.microsoft.com/office/word/2010/wordprocessingCanvas" xmlns:cx="http://schemas.microsoft.com/office/drawing/2014/chartex" xmlns:cx1="http://schemas.microsoft.com/office/drawing/2015/9/8/chartex" xmlns:cx2="http://schemas.microsoft.com/office/drawing/2015/10/21/chartex" xmlns:cx3="http://schemas.microsoft.com/office/drawing/2016/5/9/chartex" xmlns:cx4="http://schemas.microsoft.com/office/drawing/2016/5/10/chartex" xmlns:cx5="http://schemas.microsoft.com/office/drawing/2016/5/11/chartex" xmlns:cx6="http://schemas.microsoft.com/office/drawing/2016/5/12/chartex" xmlns:cx7="http://schemas.microsoft.com/office/drawing/2016/5/13/chartex" xmlns:cx8="http://schemas.microsoft.com/office/drawing/2016/5/14/chartex" xmlns:mc="http://schemas.openxmlformats.org/markup-compatibility/2006" xmlns:aink="http://schemas.microsoft.com/office/drawing/2016/ink" xmlns:am3d="http://schemas.microsoft.com/office/drawing/2017/model3d" xmlns:o="urn:schemas-microsoft-com:office:office" xmlns:oel="http://schemas.microsoft.com/office/2019/extlst" xmlns:r="http://schemas.openxmlformats.org/officeDocument/2006/relationships" xmlns:m="http://schemas.openxmlformats.org/officeDocument/2006/math" xmlns:v="urn:schemas-microsoft-com:vml" xmlns:wp14="http://schemas.microsoft.com/office/word/2010/wordprocessingDrawing" xmlns:wp="http://schemas.openxmlformats.org/drawingml/2006/wordprocessingDrawing" xmlns:w10="urn:schemas-microsoft-com:office:word" xmlns:w="http://schemas.openxmlformats.org/wordprocessingml/2006/main" xmlns:w14="http://schemas.microsoft.com/office/word/2010/wordml" xmlns:w15="http://schemas.microsoft.com/office/word/2012/wordml" xmlns:w16cex="http://schemas.microsoft.com/office/word/2018/wordml/cex" xmlns:w16cid="http://schemas.microsoft.com/office/word/2016/wordml/cid" xmlns:w16="http://schemas.microsoft.com/office/word/2018/wordml" xmlns:w16du="http://schemas.microsoft.com/office/word/2023/wordml/word16du" xmlns:w16sdtdh="http://schemas.microsoft.com/office/word/2020/wordml/sdtdatahash" xmlns:w16sdtfl="http://schemas.microsoft.com/office/word/2024/wordml/sdtformatlock" xmlns:w16se="http://schemas.microsoft.com/office/word/2015/wordml/symex" xmlns:wpg="http://schemas.microsoft.com/office/word/2010/wordprocessingGroup" xmlns:wpi="http://schemas.microsoft.com/office/word/2010/wordprocessingInk" xmlns:wne="http://schemas.microsoft.com/office/word/2006/wordml" xmlns:wps="http://schemas.microsoft.com/office/word/2010/wordprocessingShape" mc:Ignorable="w14 w15 w16se w16cid w16 w16cex w16sdtdh w16sdtfl w16du wp14">
   <w:p>
     <w:pPr>
       <w:pStyle w:val="Fuzeile"/>
@@ -4961,7 +5020,7 @@
 </file>
 
 <file path=word/footnotes.xml><?xml version="1.0" encoding="utf-8"?>
-<w:footnotes xmlns:wpc="http://schemas.microsoft.com/office/word/2010/wordprocessingCanvas" xmlns:cx="http://schemas.microsoft.com/office/drawing/2014/chartex" xmlns:cx1="http://schemas.microsoft.com/office/drawing/2015/9/8/chartex" xmlns:cx2="http://schemas.microsoft.com/office/drawing/2015/10/21/chartex" xmlns:cx3="http://schemas.microsoft.com/office/drawing/2016/5/9/chartex" xmlns:cx4="http://schemas.microsoft.com/office/drawing/2016/5/10/chartex" xmlns:cx5="http://schemas.microsoft.com/office/drawing/2016/5/11/chartex" xmlns:cx6="http://schemas.microsoft.com/office/drawing/2016/5/12/chartex" xmlns:cx7="http://schemas.microsoft.com/office/drawing/2016/5/13/chartex" xmlns:cx8="http://schemas.microsoft.com/office/drawing/2016/5/14/chartex" xmlns:mc="http://schemas.openxmlformats.org/markup-compatibility/2006" xmlns:aink="http://schemas.microsoft.com/office/drawing/2016/ink" xmlns:am3d="http://schemas.microsoft.com/office/drawing/2017/model3d" xmlns:o="urn:schemas-microsoft-com:office:office" xmlns:r="http://schemas.openxmlformats.org/officeDocument/2006/relationships" xmlns:m="http://schemas.openxmlformats.org/officeDocument/2006/math" xmlns:v="urn:schemas-microsoft-com:vml" xmlns:wp14="http://schemas.microsoft.com/office/word/2010/wordprocessingDrawing" xmlns:wp="http://schemas.openxmlformats.org/drawingml/2006/wordprocessingDrawing" xmlns:w10="urn:schemas-microsoft-com:office:word" xmlns:w="http://schemas.openxmlformats.org/wordprocessingml/2006/main" xmlns:w14="http://schemas.microsoft.com/office/word/2010/wordml" xmlns:w15="http://schemas.microsoft.com/office/word/2012/wordml" xmlns:w16cid="http://schemas.microsoft.com/office/word/2016/wordml/cid" xmlns:w16se="http://schemas.microsoft.com/office/word/2015/wordml/symex" xmlns:wpg="http://schemas.microsoft.com/office/word/2010/wordprocessingGroup" xmlns:wpi="http://schemas.microsoft.com/office/word/2010/wordprocessingInk" xmlns:wne="http://schemas.microsoft.com/office/word/2006/wordml" xmlns:wps="http://schemas.microsoft.com/office/word/2010/wordprocessingShape" mc:Ignorable="w14 w15 w16se w16cid wp14">
+<w:footnotes xmlns:wpc="http://schemas.microsoft.com/office/word/2010/wordprocessingCanvas" xmlns:cx="http://schemas.microsoft.com/office/drawing/2014/chartex" xmlns:cx1="http://schemas.microsoft.com/office/drawing/2015/9/8/chartex" xmlns:cx2="http://schemas.microsoft.com/office/drawing/2015/10/21/chartex" xmlns:cx3="http://schemas.microsoft.com/office/drawing/2016/5/9/chartex" xmlns:cx4="http://schemas.microsoft.com/office/drawing/2016/5/10/chartex" xmlns:cx5="http://schemas.microsoft.com/office/drawing/2016/5/11/chartex" xmlns:cx6="http://schemas.microsoft.com/office/drawing/2016/5/12/chartex" xmlns:cx7="http://schemas.microsoft.com/office/drawing/2016/5/13/chartex" xmlns:cx8="http://schemas.microsoft.com/office/drawing/2016/5/14/chartex" xmlns:mc="http://schemas.openxmlformats.org/markup-compatibility/2006" xmlns:aink="http://schemas.microsoft.com/office/drawing/2016/ink" xmlns:am3d="http://schemas.microsoft.com/office/drawing/2017/model3d" xmlns:o="urn:schemas-microsoft-com:office:office" xmlns:oel="http://schemas.microsoft.com/office/2019/extlst" xmlns:r="http://schemas.openxmlformats.org/officeDocument/2006/relationships" xmlns:m="http://schemas.openxmlformats.org/officeDocument/2006/math" xmlns:v="urn:schemas-microsoft-com:vml" xmlns:wp14="http://schemas.microsoft.com/office/word/2010/wordprocessingDrawing" xmlns:wp="http://schemas.openxmlformats.org/drawingml/2006/wordprocessingDrawing" xmlns:w10="urn:schemas-microsoft-com:office:word" xmlns:w="http://schemas.openxmlformats.org/wordprocessingml/2006/main" xmlns:w14="http://schemas.microsoft.com/office/word/2010/wordml" xmlns:w15="http://schemas.microsoft.com/office/word/2012/wordml" xmlns:w16cex="http://schemas.microsoft.com/office/word/2018/wordml/cex" xmlns:w16cid="http://schemas.microsoft.com/office/word/2016/wordml/cid" xmlns:w16="http://schemas.microsoft.com/office/word/2018/wordml" xmlns:w16du="http://schemas.microsoft.com/office/word/2023/wordml/word16du" xmlns:w16sdtdh="http://schemas.microsoft.com/office/word/2020/wordml/sdtdatahash" xmlns:w16sdtfl="http://schemas.microsoft.com/office/word/2024/wordml/sdtformatlock" xmlns:w16se="http://schemas.microsoft.com/office/word/2015/wordml/symex" xmlns:wpg="http://schemas.microsoft.com/office/word/2010/wordprocessingGroup" xmlns:wpi="http://schemas.microsoft.com/office/word/2010/wordprocessingInk" xmlns:wne="http://schemas.microsoft.com/office/word/2006/wordml" xmlns:wps="http://schemas.microsoft.com/office/word/2010/wordprocessingShape" mc:Ignorable="w14 w15 w16se w16cid w16 w16cex w16sdtdh w16sdtfl w16du wp14">
   <w:footnote w:type="separator" w:id="-1">
     <w:p>
       <w:r>
@@ -4980,7 +5039,7 @@
 </file>
 
 <file path=word/header1.xml><?xml version="1.0" encoding="utf-8"?>
-<w:hdr xmlns:wpc="http://schemas.microsoft.com/office/word/2010/wordprocessingCanvas" xmlns:cx="http://schemas.microsoft.com/office/drawing/2014/chartex" xmlns:cx1="http://schemas.microsoft.com/office/drawing/2015/9/8/chartex" xmlns:cx2="http://schemas.microsoft.com/office/drawing/2015/10/21/chartex" xmlns:cx3="http://schemas.microsoft.com/office/drawing/2016/5/9/chartex" xmlns:cx4="http://schemas.microsoft.com/office/drawing/2016/5/10/chartex" xmlns:cx5="http://schemas.microsoft.com/office/drawing/2016/5/11/chartex" xmlns:cx6="http://schemas.microsoft.com/office/drawing/2016/5/12/chartex" xmlns:cx7="http://schemas.microsoft.com/office/drawing/2016/5/13/chartex" xmlns:cx8="http://schemas.microsoft.com/office/drawing/2016/5/14/chartex" xmlns:mc="http://schemas.openxmlformats.org/markup-compatibility/2006" xmlns:aink="http://schemas.microsoft.com/office/drawing/2016/ink" xmlns:am3d="http://schemas.microsoft.com/office/drawing/2017/model3d" xmlns:o="urn:schemas-microsoft-com:office:office" xmlns:r="http://schemas.openxmlformats.org/officeDocument/2006/relationships" xmlns:m="http://schemas.openxmlformats.org/officeDocument/2006/math" xmlns:v="urn:schemas-microsoft-com:vml" xmlns:wp14="http://schemas.microsoft.com/office/word/2010/wordprocessingDrawing" xmlns:wp="http://schemas.openxmlformats.org/drawingml/2006/wordprocessingDrawing" xmlns:w10="urn:schemas-microsoft-com:office:word" xmlns:w="http://schemas.openxmlformats.org/wordprocessingml/2006/main" xmlns:w14="http://schemas.microsoft.com/office/word/2010/wordml" xmlns:w15="http://schemas.microsoft.com/office/word/2012/wordml" xmlns:w16cid="http://schemas.microsoft.com/office/word/2016/wordml/cid" xmlns:w16se="http://schemas.microsoft.com/office/word/2015/wordml/symex" xmlns:wpg="http://schemas.microsoft.com/office/word/2010/wordprocessingGroup" xmlns:wpi="http://schemas.microsoft.com/office/word/2010/wordprocessingInk" xmlns:wne="http://schemas.microsoft.com/office/word/2006/wordml" xmlns:wps="http://schemas.microsoft.com/office/word/2010/wordprocessingShape" mc:Ignorable="w14 w15 w16se w16cid wp14">
+<w:hdr xmlns:wpc="http://schemas.microsoft.com/office/word/2010/wordprocessingCanvas" xmlns:cx="http://schemas.microsoft.com/office/drawing/2014/chartex" xmlns:cx1="http://schemas.microsoft.com/office/drawing/2015/9/8/chartex" xmlns:cx2="http://schemas.microsoft.com/office/drawing/2015/10/21/chartex" xmlns:cx3="http://schemas.microsoft.com/office/drawing/2016/5/9/chartex" xmlns:cx4="http://schemas.microsoft.com/office/drawing/2016/5/10/chartex" xmlns:cx5="http://schemas.microsoft.com/office/drawing/2016/5/11/chartex" xmlns:cx6="http://schemas.microsoft.com/office/drawing/2016/5/12/chartex" xmlns:cx7="http://schemas.microsoft.com/office/drawing/2016/5/13/chartex" xmlns:cx8="http://schemas.microsoft.com/office/drawing/2016/5/14/chartex" xmlns:mc="http://schemas.openxmlformats.org/markup-compatibility/2006" xmlns:aink="http://schemas.microsoft.com/office/drawing/2016/ink" xmlns:am3d="http://schemas.microsoft.com/office/drawing/2017/model3d" xmlns:o="urn:schemas-microsoft-com:office:office" xmlns:oel="http://schemas.microsoft.com/office/2019/extlst" xmlns:r="http://schemas.openxmlformats.org/officeDocument/2006/relationships" xmlns:m="http://schemas.openxmlformats.org/officeDocument/2006/math" xmlns:v="urn:schemas-microsoft-com:vml" xmlns:wp14="http://schemas.microsoft.com/office/word/2010/wordprocessingDrawing" xmlns:wp="http://schemas.openxmlformats.org/drawingml/2006/wordprocessingDrawing" xmlns:w10="urn:schemas-microsoft-com:office:word" xmlns:w="http://schemas.openxmlformats.org/wordprocessingml/2006/main" xmlns:w14="http://schemas.microsoft.com/office/word/2010/wordml" xmlns:w15="http://schemas.microsoft.com/office/word/2012/wordml" xmlns:w16cex="http://schemas.microsoft.com/office/word/2018/wordml/cex" xmlns:w16cid="http://schemas.microsoft.com/office/word/2016/wordml/cid" xmlns:w16="http://schemas.microsoft.com/office/word/2018/wordml" xmlns:w16du="http://schemas.microsoft.com/office/word/2023/wordml/word16du" xmlns:w16sdtdh="http://schemas.microsoft.com/office/word/2020/wordml/sdtdatahash" xmlns:w16sdtfl="http://schemas.microsoft.com/office/word/2024/wordml/sdtformatlock" xmlns:w16se="http://schemas.microsoft.com/office/word/2015/wordml/symex" xmlns:wpg="http://schemas.microsoft.com/office/word/2010/wordprocessingGroup" xmlns:wpi="http://schemas.microsoft.com/office/word/2010/wordprocessingInk" xmlns:wne="http://schemas.microsoft.com/office/word/2006/wordml" xmlns:wps="http://schemas.microsoft.com/office/word/2010/wordprocessingShape" mc:Ignorable="w14 w15 w16se w16cid w16 w16cex w16sdtdh w16sdtfl w16du wp14">
   <w:p>
     <w:pPr>
       <w:pStyle w:val="Kopfzeile"/>
@@ -5122,7 +5181,7 @@
 </file>
 
 <file path=word/numbering.xml><?xml version="1.0" encoding="utf-8"?>
-<w:numbering xmlns:wpc="http://schemas.microsoft.com/office/word/2010/wordprocessingCanvas" xmlns:cx="http://schemas.microsoft.com/office/drawing/2014/chartex" xmlns:cx1="http://schemas.microsoft.com/office/drawing/2015/9/8/chartex" xmlns:cx2="http://schemas.microsoft.com/office/drawing/2015/10/21/chartex" xmlns:cx3="http://schemas.microsoft.com/office/drawing/2016/5/9/chartex" xmlns:cx4="http://schemas.microsoft.com/office/drawing/2016/5/10/chartex" xmlns:cx5="http://schemas.microsoft.com/office/drawing/2016/5/11/chartex" xmlns:cx6="http://schemas.microsoft.com/office/drawing/2016/5/12/chartex" xmlns:cx7="http://schemas.microsoft.com/office/drawing/2016/5/13/chartex" xmlns:cx8="http://schemas.microsoft.com/office/drawing/2016/5/14/chartex" xmlns:mc="http://schemas.openxmlformats.org/markup-compatibility/2006" xmlns:aink="http://schemas.microsoft.com/office/drawing/2016/ink" xmlns:am3d="http://schemas.microsoft.com/office/drawing/2017/model3d" xmlns:o="urn:schemas-microsoft-com:office:office" xmlns:r="http://schemas.openxmlformats.org/officeDocument/2006/relationships" xmlns:m="http://schemas.openxmlformats.org/officeDocument/2006/math" xmlns:v="urn:schemas-microsoft-com:vml" xmlns:wp14="http://schemas.microsoft.com/office/word/2010/wordprocessingDrawing" xmlns:wp="http://schemas.openxmlformats.org/drawingml/2006/wordprocessingDrawing" xmlns:w10="urn:schemas-microsoft-com:office:word" xmlns:w="http://schemas.openxmlformats.org/wordprocessingml/2006/main" xmlns:w14="http://schemas.microsoft.com/office/word/2010/wordml" xmlns:w15="http://schemas.microsoft.com/office/word/2012/wordml" xmlns:w16cid="http://schemas.microsoft.com/office/word/2016/wordml/cid" xmlns:w16se="http://schemas.microsoft.com/office/word/2015/wordml/symex" xmlns:wpg="http://schemas.microsoft.com/office/word/2010/wordprocessingGroup" xmlns:wpi="http://schemas.microsoft.com/office/word/2010/wordprocessingInk" xmlns:wne="http://schemas.microsoft.com/office/word/2006/wordml" xmlns:wps="http://schemas.microsoft.com/office/word/2010/wordprocessingShape" mc:Ignorable="w14 w15 w16se w16cid wp14">
+<w:numbering xmlns:wpc="http://schemas.microsoft.com/office/word/2010/wordprocessingCanvas" xmlns:cx="http://schemas.microsoft.com/office/drawing/2014/chartex" xmlns:cx1="http://schemas.microsoft.com/office/drawing/2015/9/8/chartex" xmlns:cx2="http://schemas.microsoft.com/office/drawing/2015/10/21/chartex" xmlns:cx3="http://schemas.microsoft.com/office/drawing/2016/5/9/chartex" xmlns:cx4="http://schemas.microsoft.com/office/drawing/2016/5/10/chartex" xmlns:cx5="http://schemas.microsoft.com/office/drawing/2016/5/11/chartex" xmlns:cx6="http://schemas.microsoft.com/office/drawing/2016/5/12/chartex" xmlns:cx7="http://schemas.microsoft.com/office/drawing/2016/5/13/chartex" xmlns:cx8="http://schemas.microsoft.com/office/drawing/2016/5/14/chartex" xmlns:mc="http://schemas.openxmlformats.org/markup-compatibility/2006" xmlns:aink="http://schemas.microsoft.com/office/drawing/2016/ink" xmlns:am3d="http://schemas.microsoft.com/office/drawing/2017/model3d" xmlns:o="urn:schemas-microsoft-com:office:office" xmlns:oel="http://schemas.microsoft.com/office/2019/extlst" xmlns:r="http://schemas.openxmlformats.org/officeDocument/2006/relationships" xmlns:m="http://schemas.openxmlformats.org/officeDocument/2006/math" xmlns:v="urn:schemas-microsoft-com:vml" xmlns:wp14="http://schemas.microsoft.com/office/word/2010/wordprocessingDrawing" xmlns:wp="http://schemas.openxmlformats.org/drawingml/2006/wordprocessingDrawing" xmlns:w10="urn:schemas-microsoft-com:office:word" xmlns:w="http://schemas.openxmlformats.org/wordprocessingml/2006/main" xmlns:w14="http://schemas.microsoft.com/office/word/2010/wordml" xmlns:w15="http://schemas.microsoft.com/office/word/2012/wordml" xmlns:w16cex="http://schemas.microsoft.com/office/word/2018/wordml/cex" xmlns:w16cid="http://schemas.microsoft.com/office/word/2016/wordml/cid" xmlns:w16="http://schemas.microsoft.com/office/word/2018/wordml" xmlns:w16du="http://schemas.microsoft.com/office/word/2023/wordml/word16du" xmlns:w16sdtdh="http://schemas.microsoft.com/office/word/2020/wordml/sdtdatahash" xmlns:w16sdtfl="http://schemas.microsoft.com/office/word/2024/wordml/sdtformatlock" xmlns:w16se="http://schemas.microsoft.com/office/word/2015/wordml/symex" xmlns:wpg="http://schemas.microsoft.com/office/word/2010/wordprocessingGroup" xmlns:wpi="http://schemas.microsoft.com/office/word/2010/wordprocessingInk" xmlns:wne="http://schemas.microsoft.com/office/word/2006/wordml" xmlns:wps="http://schemas.microsoft.com/office/word/2010/wordprocessingShape" mc:Ignorable="w14 w15 w16se w16cid w16 w16cex w16sdtdh w16sdtfl w16du wp14">
   <w:abstractNum w:abstractNumId="0" w15:restartNumberingAfterBreak="0">
     <w:nsid w:val="4D5912AE"/>
     <w:multiLevelType w:val="hybridMultilevel"/>
@@ -5351,17 +5410,17 @@
       </w:rPr>
     </w:lvl>
   </w:abstractNum>
-  <w:num w:numId="1">
+  <w:num w:numId="1" w16cid:durableId="1106465064">
     <w:abstractNumId w:val="1"/>
   </w:num>
-  <w:num w:numId="2">
+  <w:num w:numId="2" w16cid:durableId="626473959">
     <w:abstractNumId w:val="0"/>
   </w:num>
 </w:numbering>
 </file>
 
 <file path=word/styles.xml><?xml version="1.0" encoding="utf-8"?>
-<w:styles xmlns:mc="http://schemas.openxmlformats.org/markup-compatibility/2006" xmlns:r="http://schemas.openxmlformats.org/officeDocument/2006/relationships" xmlns:w="http://schemas.openxmlformats.org/wordprocessingml/2006/main" xmlns:w14="http://schemas.microsoft.com/office/word/2010/wordml" xmlns:w15="http://schemas.microsoft.com/office/word/2012/wordml" xmlns:w16cid="http://schemas.microsoft.com/office/word/2016/wordml/cid" xmlns:w16se="http://schemas.microsoft.com/office/word/2015/wordml/symex" mc:Ignorable="w14 w15 w16se w16cid">
+<w:styles xmlns:mc="http://schemas.openxmlformats.org/markup-compatibility/2006" xmlns:r="http://schemas.openxmlformats.org/officeDocument/2006/relationships" xmlns:w="http://schemas.openxmlformats.org/wordprocessingml/2006/main" xmlns:w14="http://schemas.microsoft.com/office/word/2010/wordml" xmlns:w15="http://schemas.microsoft.com/office/word/2012/wordml" xmlns:w16cex="http://schemas.microsoft.com/office/word/2018/wordml/cex" xmlns:w16cid="http://schemas.microsoft.com/office/word/2016/wordml/cid" xmlns:w16="http://schemas.microsoft.com/office/word/2018/wordml" xmlns:w16du="http://schemas.microsoft.com/office/word/2023/wordml/word16du" xmlns:w16sdtdh="http://schemas.microsoft.com/office/word/2020/wordml/sdtdatahash" xmlns:w16sdtfl="http://schemas.microsoft.com/office/word/2024/wordml/sdtformatlock" xmlns:w16se="http://schemas.microsoft.com/office/word/2015/wordml/symex" mc:Ignorable="w14 w15 w16se w16cid w16 w16cex w16sdtdh w16sdtfl w16du">
   <w:docDefaults>
     <w:rPrDefault>
       <w:rPr>
@@ -5377,7 +5436,7 @@
       </w:pPr>
     </w:pPrDefault>
   </w:docDefaults>
-  <w:latentStyles w:defLockedState="0" w:defUIPriority="99" w:defSemiHidden="0" w:defUnhideWhenUsed="0" w:defQFormat="0" w:count="375">
+  <w:latentStyles w:defLockedState="0" w:defUIPriority="99" w:defSemiHidden="0" w:defUnhideWhenUsed="0" w:defQFormat="0" w:count="376">
     <w:lsdException w:name="Normal" w:uiPriority="0" w:qFormat="1"/>
     <w:lsdException w:name="heading 1" w:uiPriority="9" w:qFormat="1"/>
     <w:lsdException w:name="heading 2" w:semiHidden="1" w:uiPriority="9" w:unhideWhenUsed="1" w:qFormat="1"/>
@@ -5753,6 +5812,7 @@
     <w:lsdException w:name="Smart Hyperlink" w:semiHidden="1" w:unhideWhenUsed="1"/>
     <w:lsdException w:name="Hashtag" w:semiHidden="1" w:unhideWhenUsed="1"/>
     <w:lsdException w:name="Unresolved Mention" w:semiHidden="1" w:unhideWhenUsed="1"/>
+    <w:lsdException w:name="Smart Link" w:semiHidden="1" w:unhideWhenUsed="1"/>
   </w:latentStyles>
   <w:style w:type="paragraph" w:default="1" w:styleId="Standard">
     <w:name w:val="Normal"/>

</xml_diff>